<commit_message>
eight semester course materials are added
</commit_message>
<xml_diff>
--- a/8-semester/professional practice/zulqarnain_SP21379_assignment_01.docx
+++ b/8-semester/professional practice/zulqarnain_SP21379_assignment_01.docx
@@ -482,7 +482,33 @@
           <w:szCs w:val="24"/>
           <w:lang w:bidi="ar-SA"/>
         </w:rPr>
-        <w:t xml:space="preserve">"Fostering Professionalism in Software Engineering: An Early-Exposure Approach" (published in </w:t>
+        <w:t>"Fostering Professionalism in Software Engineering: An Early-Exposure Approach"</w:t>
+      </w:r>
+      <w:r>
+        <w:rPr>
+          <w:rFonts w:ascii="Times New Roman" w:eastAsia="Times New Roman" w:hAnsi="Times New Roman" w:cs="Times New Roman"/>
+          <w:color w:val="1F1F1F"/>
+          <w:sz w:val="24"/>
+          <w:szCs w:val="24"/>
+          <w:lang w:bidi="ar-SA"/>
+        </w:rPr>
+        <w:t>(</w:t>
+      </w:r>
+      <w:r>
+        <w:t>University of Auckland</w:t>
+      </w:r>
+      <w:r>
+        <w:t>)</w:t>
+      </w:r>
+      <w:r>
+        <w:rPr>
+          <w:rFonts w:ascii="Times New Roman" w:eastAsia="Times New Roman" w:hAnsi="Times New Roman" w:cs="Times New Roman"/>
+          <w:color w:val="1F1F1F"/>
+          <w:sz w:val="24"/>
+          <w:szCs w:val="24"/>
+          <w:lang w:bidi="ar-SA"/>
+        </w:rPr>
+        <w:t xml:space="preserve"> (published in </w:t>
       </w:r>
       <w:r>
         <w:rPr>
@@ -1438,39 +1464,7 @@
           <w:sz w:val="24"/>
           <w:szCs w:val="24"/>
         </w:rPr>
-        <w:t> subject from the very start</w:t>
-      </w:r>
-      <w:r>
-        <w:rPr>
-          <w:rFonts w:asciiTheme="majorBidi" w:hAnsiTheme="majorBidi" w:cstheme="majorBidi"/>
-          <w:sz w:val="24"/>
-          <w:szCs w:val="24"/>
-        </w:rPr>
-        <w:t xml:space="preserve"> </w:t>
-      </w:r>
-      <w:r>
-        <w:rPr>
-          <w:rFonts w:asciiTheme="majorBidi" w:hAnsiTheme="majorBidi" w:cstheme="majorBidi"/>
-          <w:sz w:val="24"/>
-          <w:szCs w:val="24"/>
-        </w:rPr>
-        <w:t>rather than just a minor detail at the end</w:t>
-      </w:r>
-      <w:r>
-        <w:rPr>
-          <w:rFonts w:asciiTheme="majorBidi" w:hAnsiTheme="majorBidi" w:cstheme="majorBidi"/>
-          <w:sz w:val="24"/>
-          <w:szCs w:val="24"/>
-        </w:rPr>
-        <w:t xml:space="preserve"> </w:t>
-      </w:r>
-      <w:r>
-        <w:rPr>
-          <w:rFonts w:asciiTheme="majorBidi" w:hAnsiTheme="majorBidi" w:cstheme="majorBidi"/>
-          <w:sz w:val="24"/>
-          <w:szCs w:val="24"/>
-        </w:rPr>
-        <w:t>is the best way to get students ready for the real-world </w:t>
+        <w:t> subject from the very start rather than just a minor detail at the end is the best way to get students ready for the real-world </w:t>
       </w:r>
       <w:r>
         <w:rPr>

</xml_diff>